<commit_message>
Address Pre-Submission Reviews of the PSS Manuscript
Three internal reviews (methods, domain, editor) found inconsistent spin-sense
error counts, an overstated count of new spin senses, an unsupported noise
bound, and Yarkovsky segregation already shown by Durech & Hanus 2023.
Fixes: recount new senses against six pole catalogues (1,447), report sense
accuracy by pole latitude, explain the retrograde excess as selection, give
binomial intervals and tighter tolerances, bracket candidate reliability
(60-87%), print the 39 survey-contradicted LCDB periods, add conclusions and
an Elsevier-style AI declaration.

Co-Authored-By: Claude Opus 5.5 <noreply@anthropic.com>
</commit_message>
<xml_diff>
--- a/paper/pss/highlights.docx
+++ b/paper/pss/highlights.docx
@@ -15,7 +15,7 @@
         <w:pStyle w:val="ListBullet"/>
       </w:pPr>
       <w:r>
-        <w:t>Calibrated Gaia DR3 periods for 6,238 asteroids, 89% correct on held-out LCDB</w:t>
+        <w:t>6,238 Gaia DR3 rotation periods with a tested probability; 1,680 new to DR3 work</w:t>
       </w:r>
     </w:p>
     <w:p>
@@ -23,7 +23,7 @@
         <w:pStyle w:val="ListBullet"/>
       </w:pPr>
       <w:r>
-        <w:t>Spin senses agree with independent ATLAS poles for 96%; 2,270 have no prior pole</w:t>
+        <w:t>Spin senses agree with independent ATLAS poles for 96%; 1,447 lack a known pole</w:t>
       </w:r>
     </w:p>
     <w:p>
@@ -31,7 +31,7 @@
         <w:pStyle w:val="ListBullet"/>
       </w:pPr>
       <w:r>
-        <w:t>Spin senses reproduce Yarkovsky segregation in families: 75% vs 52% null</w:t>
+        <w:t>39 LCDB periods disagree with independent surveys; 69 more are flagged</w:t>
       </w:r>
     </w:p>
     <w:p>
@@ -39,7 +39,7 @@
         <w:pStyle w:val="ListBullet"/>
       </w:pPr>
       <w:r>
-        <w:t>108 LCDB periods disputed, 39 of them contradicted by independent surveys</w:t>
+        <w:t>790 candidate new periods: 4-5% noise, 60-87% expected to be correct</w:t>
       </w:r>
     </w:p>
     <w:p>
@@ -47,7 +47,7 @@
         <w:pStyle w:val="ListBullet"/>
       </w:pPr>
       <w:r>
-        <w:t>790 candidate new periods absent from SsODNet, with noise below 5%</w:t>
+        <w:t>The pipeline, thresholds and null tests are ready to rerun on Gaia DR4</w:t>
       </w:r>
     </w:p>
     <w:sectPr>

</xml_diff>

<commit_message>
Finalise PSS Manuscript After Editor Re-Check and Update README to v1.1.0
Spin-sense accuracy by pole latitude now uses the same 3,535 asteroids as
the total; the candidate-reliability range is 61-87 %; abstract, highlights
and body agree; README reports 790 candidates and the independent checks.

Co-Authored-By: Claude Opus 5.5 <noreply@anthropic.com>
</commit_message>
<xml_diff>
--- a/paper/pss/highlights.docx
+++ b/paper/pss/highlights.docx
@@ -23,7 +23,7 @@
         <w:pStyle w:val="ListBullet"/>
       </w:pPr>
       <w:r>
-        <w:t>Spin senses agree with independent ATLAS poles for 96%; 1,447 lack a known pole</w:t>
+        <w:t>Spin senses match independent ATLAS poles for 96%; 1,447 have no catalogued pole</w:t>
       </w:r>
     </w:p>
     <w:p>
@@ -39,7 +39,7 @@
         <w:pStyle w:val="ListBullet"/>
       </w:pPr>
       <w:r>
-        <w:t>790 candidate new periods: 4-5% noise, 60-87% expected to be correct</w:t>
+        <w:t>790 candidate new periods: 4-5% noise, 61-87% expected to be correct</w:t>
       </w:r>
     </w:p>
     <w:p>

</xml_diff>